<commit_message>
Chapitre 4 : A confirmer
</commit_message>
<xml_diff>
--- a/Memoire_M2_GID_3866_V01.docx
+++ b/Memoire_M2_GID_3866_V01.docx
@@ -5,6 +5,14 @@
     <w:tbl>
       <w:tblPr>
         <w:tblW w:w="0" w:type="auto"/>
+        <w:tblBorders>
+          <w:top w:val="single" w:sz="4" w:space="0" w:color="auto"/>
+          <w:left w:val="single" w:sz="4" w:space="0" w:color="auto"/>
+          <w:bottom w:val="single" w:sz="4" w:space="0" w:color="auto"/>
+          <w:right w:val="single" w:sz="4" w:space="0" w:color="auto"/>
+          <w:insideH w:val="single" w:sz="4" w:space="0" w:color="auto"/>
+          <w:insideV w:val="single" w:sz="4" w:space="0" w:color="auto"/>
+        </w:tblBorders>
         <w:tblLook w:val="04A0" w:firstRow="1" w:lastRow="0" w:firstColumn="1" w:lastColumn="0" w:noHBand="0" w:noVBand="1"/>
       </w:tblPr>
       <w:tblGrid>
@@ -18,7 +26,7 @@
           <w:p>
             <w:pPr>
               <w:spacing w:line="276" w:lineRule="auto"/>
-              <w:jc w:val="center"/>
+              <w:jc w:val="right"/>
               <w:rPr>
                 <w:rFonts w:cs="Times New Roman"/>
                 <w:sz w:val="32"/>
@@ -33,73 +41,16 @@
                 <w:szCs w:val="28"/>
               </w:rPr>
               <w:drawing>
-                <wp:anchor distT="0" distB="0" distL="114300" distR="114300" simplePos="0" relativeHeight="251659264" behindDoc="0" locked="0" layoutInCell="1" allowOverlap="1" wp14:anchorId="5502F0AA" wp14:editId="229DEC55">
+                <wp:anchor distT="0" distB="0" distL="114300" distR="114300" simplePos="0" relativeHeight="251660288" behindDoc="0" locked="0" layoutInCell="1" allowOverlap="1" wp14:anchorId="22F4755A" wp14:editId="7F39A60F">
                   <wp:simplePos x="0" y="0"/>
                   <wp:positionH relativeFrom="margin">
-                    <wp:posOffset>0</wp:posOffset>
+                    <wp:posOffset>822325</wp:posOffset>
                   </wp:positionH>
                   <wp:positionV relativeFrom="margin">
-                    <wp:posOffset>41113</wp:posOffset>
+                    <wp:posOffset>38735</wp:posOffset>
                   </wp:positionV>
-                  <wp:extent cx="581025" cy="738505"/>
-                  <wp:effectExtent l="0" t="0" r="9525" b="4445"/>
-                  <wp:wrapSquare wrapText="bothSides"/>
-                  <wp:docPr id="5" name="Image 5"/>
-                  <wp:cNvGraphicFramePr>
-                    <a:graphicFrameLocks xmlns:a="http://schemas.openxmlformats.org/drawingml/2006/main" noChangeAspect="1"/>
-                  </wp:cNvGraphicFramePr>
-                  <a:graphic xmlns:a="http://schemas.openxmlformats.org/drawingml/2006/main">
-                    <a:graphicData uri="http://schemas.openxmlformats.org/drawingml/2006/picture">
-                      <pic:pic xmlns:pic="http://schemas.openxmlformats.org/drawingml/2006/picture">
-                        <pic:nvPicPr>
-                          <pic:cNvPr id="5" name="Image 5"/>
-                          <pic:cNvPicPr/>
-                        </pic:nvPicPr>
-                        <pic:blipFill>
-                          <a:blip r:embed="rId7" cstate="print">
-                            <a:extLst>
-                              <a:ext uri="{28A0092B-C50C-407E-A947-70E740481C1C}">
-                                <a14:useLocalDpi xmlns:a14="http://schemas.microsoft.com/office/drawing/2010/main" val="0"/>
-                              </a:ext>
-                            </a:extLst>
-                          </a:blip>
-                          <a:stretch>
-                            <a:fillRect/>
-                          </a:stretch>
-                        </pic:blipFill>
-                        <pic:spPr>
-                          <a:xfrm>
-                            <a:off x="0" y="0"/>
-                            <a:ext cx="581025" cy="738505"/>
-                          </a:xfrm>
-                          <a:prstGeom prst="rect">
-                            <a:avLst/>
-                          </a:prstGeom>
-                        </pic:spPr>
-                      </pic:pic>
-                    </a:graphicData>
-                  </a:graphic>
-                </wp:anchor>
-              </w:drawing>
-            </w:r>
-            <w:r>
-              <w:rPr>
-                <w:rFonts w:cs="Times New Roman"/>
-                <w:noProof/>
-                <w:sz w:val="32"/>
-                <w:szCs w:val="28"/>
-              </w:rPr>
-              <w:drawing>
-                <wp:anchor distT="0" distB="0" distL="114300" distR="114300" simplePos="0" relativeHeight="251660288" behindDoc="0" locked="0" layoutInCell="1" allowOverlap="1" wp14:anchorId="22F4755A" wp14:editId="1746BA51">
-                  <wp:simplePos x="0" y="0"/>
-                  <wp:positionH relativeFrom="margin">
-                    <wp:posOffset>641350</wp:posOffset>
-                  </wp:positionH>
-                  <wp:positionV relativeFrom="margin">
-                    <wp:posOffset>51597</wp:posOffset>
-                  </wp:positionV>
-                  <wp:extent cx="714375" cy="714375"/>
-                  <wp:effectExtent l="0" t="0" r="9525" b="9525"/>
+                  <wp:extent cx="781050" cy="714375"/>
+                  <wp:effectExtent l="0" t="0" r="0" b="9525"/>
                   <wp:wrapSquare wrapText="bothSides"/>
                   <wp:docPr id="4" name="Image 4"/>
                   <wp:cNvGraphicFramePr>
@@ -127,7 +78,7 @@
                         <pic:spPr>
                           <a:xfrm>
                             <a:off x="0" y="0"/>
-                            <a:ext cx="714375" cy="714375"/>
+                            <a:ext cx="781050" cy="714375"/>
                           </a:xfrm>
                           <a:prstGeom prst="rect">
                             <a:avLst/>
@@ -136,7 +87,123 @@
                       </pic:pic>
                     </a:graphicData>
                   </a:graphic>
+                  <wp14:sizeRelH relativeFrom="margin">
+                    <wp14:pctWidth>0</wp14:pctWidth>
+                  </wp14:sizeRelH>
                 </wp:anchor>
+              </w:drawing>
+            </w:r>
+            <w:r>
+              <w:rPr>
+                <w:rFonts w:cs="Times New Roman"/>
+                <w:noProof/>
+                <w:sz w:val="32"/>
+                <w:szCs w:val="28"/>
+              </w:rPr>
+              <w:drawing>
+                <wp:anchor distT="0" distB="0" distL="114300" distR="114300" simplePos="0" relativeHeight="251659264" behindDoc="0" locked="0" layoutInCell="1" allowOverlap="1" wp14:anchorId="5502F0AA" wp14:editId="2B9795AA">
+                  <wp:simplePos x="0" y="0"/>
+                  <wp:positionH relativeFrom="margin">
+                    <wp:posOffset>-19050</wp:posOffset>
+                  </wp:positionH>
+                  <wp:positionV relativeFrom="margin">
+                    <wp:posOffset>0</wp:posOffset>
+                  </wp:positionV>
+                  <wp:extent cx="723900" cy="738505"/>
+                  <wp:effectExtent l="0" t="0" r="0" b="4445"/>
+                  <wp:wrapSquare wrapText="bothSides"/>
+                  <wp:docPr id="5" name="Image 5"/>
+                  <wp:cNvGraphicFramePr>
+                    <a:graphicFrameLocks xmlns:a="http://schemas.openxmlformats.org/drawingml/2006/main" noChangeAspect="1"/>
+                  </wp:cNvGraphicFramePr>
+                  <a:graphic xmlns:a="http://schemas.openxmlformats.org/drawingml/2006/main">
+                    <a:graphicData uri="http://schemas.openxmlformats.org/drawingml/2006/picture">
+                      <pic:pic xmlns:pic="http://schemas.openxmlformats.org/drawingml/2006/picture">
+                        <pic:nvPicPr>
+                          <pic:cNvPr id="5" name="Image 5"/>
+                          <pic:cNvPicPr/>
+                        </pic:nvPicPr>
+                        <pic:blipFill>
+                          <a:blip r:embed="rId9" cstate="print">
+                            <a:extLst>
+                              <a:ext uri="{28A0092B-C50C-407E-A947-70E740481C1C}">
+                                <a14:useLocalDpi xmlns:a14="http://schemas.microsoft.com/office/drawing/2010/main" val="0"/>
+                              </a:ext>
+                            </a:extLst>
+                          </a:blip>
+                          <a:stretch>
+                            <a:fillRect/>
+                          </a:stretch>
+                        </pic:blipFill>
+                        <pic:spPr>
+                          <a:xfrm>
+                            <a:off x="0" y="0"/>
+                            <a:ext cx="723900" cy="738505"/>
+                          </a:xfrm>
+                          <a:prstGeom prst="rect">
+                            <a:avLst/>
+                          </a:prstGeom>
+                        </pic:spPr>
+                      </pic:pic>
+                    </a:graphicData>
+                  </a:graphic>
+                  <wp14:sizeRelH relativeFrom="margin">
+                    <wp14:pctWidth>0</wp14:pctWidth>
+                  </wp14:sizeRelH>
+                </wp:anchor>
+              </w:drawing>
+            </w:r>
+            <w:r>
+              <w:rPr>
+                <w:noProof/>
+              </w:rPr>
+              <w:drawing>
+                <wp:inline distT="0" distB="0" distL="0" distR="0" wp14:anchorId="75CB15A7" wp14:editId="23B358E7">
+                  <wp:extent cx="1098550" cy="704850"/>
+                  <wp:effectExtent l="0" t="0" r="6350" b="0"/>
+                  <wp:docPr id="2" name="Image 2"/>
+                  <wp:cNvGraphicFramePr>
+                    <a:graphicFrameLocks xmlns:a="http://schemas.openxmlformats.org/drawingml/2006/main" noChangeAspect="1"/>
+                  </wp:cNvGraphicFramePr>
+                  <a:graphic xmlns:a="http://schemas.openxmlformats.org/drawingml/2006/main">
+                    <a:graphicData uri="http://schemas.openxmlformats.org/drawingml/2006/picture">
+                      <pic:pic xmlns:pic="http://schemas.openxmlformats.org/drawingml/2006/picture">
+                        <pic:nvPicPr>
+                          <pic:cNvPr id="0" name="Picture 1"/>
+                          <pic:cNvPicPr>
+                            <a:picLocks noChangeAspect="1" noChangeArrowheads="1"/>
+                          </pic:cNvPicPr>
+                        </pic:nvPicPr>
+                        <pic:blipFill>
+                          <a:blip r:embed="rId10" cstate="print">
+                            <a:extLst>
+                              <a:ext uri="{28A0092B-C50C-407E-A947-70E740481C1C}">
+                                <a14:useLocalDpi xmlns:a14="http://schemas.microsoft.com/office/drawing/2010/main" val="0"/>
+                              </a:ext>
+                            </a:extLst>
+                          </a:blip>
+                          <a:srcRect/>
+                          <a:stretch>
+                            <a:fillRect/>
+                          </a:stretch>
+                        </pic:blipFill>
+                        <pic:spPr bwMode="auto">
+                          <a:xfrm>
+                            <a:off x="0" y="0"/>
+                            <a:ext cx="1098550" cy="704850"/>
+                          </a:xfrm>
+                          <a:prstGeom prst="rect">
+                            <a:avLst/>
+                          </a:prstGeom>
+                          <a:noFill/>
+                          <a:ln>
+                            <a:noFill/>
+                          </a:ln>
+                        </pic:spPr>
+                      </pic:pic>
+                    </a:graphicData>
+                  </a:graphic>
+                </wp:inline>
               </w:drawing>
             </w:r>
           </w:p>
@@ -253,6 +320,15 @@
         </w:rPr>
         <w:t>Intitulé :</w:t>
       </w:r>
+    </w:p>
+    <w:p>
+      <w:pPr>
+        <w:spacing w:line="276" w:lineRule="auto"/>
+        <w:jc w:val="center"/>
+        <w:rPr>
+          <w:rFonts w:cs="Times New Roman"/>
+        </w:rPr>
+      </w:pPr>
     </w:p>
     <w:tbl>
       <w:tblPr>
@@ -575,8 +651,8 @@
         <w:pStyle w:val="Titre1"/>
         <w:spacing w:line="276" w:lineRule="auto"/>
         <w:sectPr>
-          <w:headerReference w:type="default" r:id="rId9"/>
-          <w:headerReference w:type="first" r:id="rId10"/>
+          <w:headerReference w:type="default" r:id="rId11"/>
+          <w:headerReference w:type="first" r:id="rId12"/>
           <w:pgSz w:w="11906" w:h="16838"/>
           <w:pgMar w:top="1417" w:right="1417" w:bottom="1417" w:left="1417" w:header="850" w:footer="708" w:gutter="0"/>
           <w:pgNumType w:fmt="lowerRoman" w:start="1"/>
@@ -721,7 +797,7 @@
             <w:r>
               <w:t xml:space="preserve">Email : </w:t>
             </w:r>
-            <w:hyperlink r:id="rId11" w:history="1">
+            <w:hyperlink r:id="rId13" w:history="1">
               <w:r>
                 <w:rPr>
                   <w:rStyle w:val="Lienhypertexte"/>
@@ -767,7 +843,7 @@
                           </pic:cNvPicPr>
                         </pic:nvPicPr>
                         <pic:blipFill>
-                          <a:blip r:embed="rId12">
+                          <a:blip r:embed="rId14">
                             <a:extLst>
                               <a:ext uri="{28A0092B-C50C-407E-A947-70E740481C1C}">
                                 <a14:useLocalDpi xmlns:a14="http://schemas.microsoft.com/office/drawing/2010/main" val="0"/>
@@ -2983,7 +3059,7 @@
         </w:numPr>
         <w:spacing w:line="276" w:lineRule="auto"/>
         <w:sectPr>
-          <w:headerReference w:type="default" r:id="rId13"/>
+          <w:headerReference w:type="default" r:id="rId15"/>
           <w:pgSz w:w="11906" w:h="16838"/>
           <w:pgMar w:top="1417" w:right="1417" w:bottom="1417" w:left="1417" w:header="708" w:footer="708" w:gutter="0"/>
           <w:pgNumType w:fmt="upperRoman" w:start="1"/>
@@ -9297,7 +9373,7 @@
                     <pic:cNvPicPr/>
                   </pic:nvPicPr>
                   <pic:blipFill>
-                    <a:blip r:embed="rId14">
+                    <a:blip r:embed="rId16">
                       <a:extLst>
                         <a:ext uri="{28A0092B-C50C-407E-A947-70E740481C1C}">
                           <a14:useLocalDpi xmlns:a14="http://schemas.microsoft.com/office/drawing/2010/main" val="0"/>
@@ -10732,7 +10808,7 @@
                     <pic:cNvPicPr/>
                   </pic:nvPicPr>
                   <pic:blipFill>
-                    <a:blip r:embed="rId15" cstate="print">
+                    <a:blip r:embed="rId17" cstate="print">
                       <a:extLst>
                         <a:ext uri="{28A0092B-C50C-407E-A947-70E740481C1C}">
                           <a14:useLocalDpi xmlns:a14="http://schemas.microsoft.com/office/drawing/2010/main" val="0"/>
@@ -12851,7 +12927,7 @@
         <w:pStyle w:val="Titre1"/>
         <w:spacing w:line="276" w:lineRule="auto"/>
         <w:sectPr>
-          <w:headerReference w:type="default" r:id="rId16"/>
+          <w:headerReference w:type="default" r:id="rId18"/>
           <w:pgSz w:w="11906" w:h="16838"/>
           <w:pgMar w:top="1417" w:right="1417" w:bottom="1417" w:left="1417" w:header="708" w:footer="708" w:gutter="0"/>
           <w:pgNumType w:start="1"/>
@@ -13273,7 +13349,7 @@
         <w:spacing w:line="276" w:lineRule="auto"/>
         <w:ind w:left="720"/>
         <w:sectPr>
-          <w:headerReference w:type="default" r:id="rId17"/>
+          <w:headerReference w:type="default" r:id="rId19"/>
           <w:pgSz w:w="11906" w:h="16838"/>
           <w:pgMar w:top="1417" w:right="1417" w:bottom="1417" w:left="1417" w:header="708" w:footer="708" w:gutter="0"/>
           <w:pgNumType w:fmt="upperRoman" w:start="9"/>
@@ -16259,7 +16335,7 @@
           <w:rFonts w:cs="Times New Roman"/>
         </w:rPr>
         <w:sectPr>
-          <w:headerReference w:type="default" r:id="rId18"/>
+          <w:headerReference w:type="default" r:id="rId20"/>
           <w:pgSz w:w="11906" w:h="16838"/>
           <w:pgMar w:top="1417" w:right="1417" w:bottom="1417" w:left="1417" w:header="708" w:footer="708" w:gutter="0"/>
           <w:pgNumType w:fmt="upperRoman"/>
@@ -16347,7 +16423,7 @@
     </w:p>
     <w:p/>
     <w:sectPr>
-      <w:headerReference w:type="default" r:id="rId19"/>
+      <w:headerReference w:type="default" r:id="rId21"/>
       <w:pgSz w:w="11906" w:h="16838"/>
       <w:pgMar w:top="1417" w:right="1417" w:bottom="1417" w:left="1417" w:header="708" w:footer="708" w:gutter="0"/>
       <w:pgNumType w:fmt="upperRoman" w:start="1"/>
@@ -19988,4 +20064,16 @@
     </a:ext>
   </a:extLst>
 </a:theme>
+</file>
+
+<file path=customXml/item1.xml><?xml version="1.0" encoding="utf-8"?>
+<b:Sources xmlns:b="http://schemas.openxmlformats.org/officeDocument/2006/bibliography" xmlns="http://schemas.openxmlformats.org/officeDocument/2006/bibliography" SelectedStyle="\GostName.XSL" StyleName="Gost - Tri par nom" Version="2003"/>
+</file>
+
+<file path=customXml/itemProps1.xml><?xml version="1.0" encoding="utf-8"?>
+<ds:datastoreItem xmlns:ds="http://schemas.openxmlformats.org/officeDocument/2006/customXml" ds:itemID="{E0998E38-021F-4A8E-B6D9-D556E1EB2DBD}">
+  <ds:schemaRefs>
+    <ds:schemaRef ds:uri="http://schemas.openxmlformats.org/officeDocument/2006/bibliography"/>
+  </ds:schemaRefs>
+</ds:datastoreItem>
 </file>
</xml_diff>